<commit_message>
feat(ca4): doc-type templates, exemplars, overlays (fb-595.7.5.68)
Hand-landed from run 95800020f39b822e4b9c437d on its snapshot base; the patch no longer applied to master.
</commit_message>
<xml_diff>
--- a/courts/fourth-circuit/court-of-appeals/answering-brief/samples/OUTPUT-chapman-answering-brief.docx
+++ b/courts/fourth-circuit/court-of-appeals/answering-brief/samples/OUTPUT-chapman-answering-brief.docx
@@ -2589,15 +2589,14 @@
         </w:sectPr>
       </w:pPr>
     </w:p>
+    <w:bookmarkStart w:id="20" w:name="questions-presented-for-review"/>
     <w:p>
       <w:pPr>
         <w:pStyle w:val="Heading1"/>
       </w:pPr>
-      <w:bookmarkStart w:id="9" w:name="_3c7affb7d5699dce7341175c09ea6a46dbc7d1a"/>
       <w:r>
         <w:t xml:space="preserve">QUESTIONS PRESENTED FOR REVIEW</w:t>
       </w:r>
-      <w:bookmarkEnd w:id="9"/>
     </w:p>
     <w:p>
       <w:pPr>
@@ -2623,15 +2622,15 @@
         <w:t xml:space="preserve">3. Did the district court correctly conclude that Mr. Chapman failed to establish that his employer’s legitimate, non-discriminatory reasons behind its corrective action against him were pretextual in light of the well-documented history of his performance deficiencies?</w:t>
       </w:r>
     </w:p>
+    <w:bookmarkEnd w:id="20"/>
+    <w:bookmarkStart w:id="25" w:name="statement-of-the-case"/>
     <w:p>
       <w:pPr>
         <w:pStyle w:val="Heading1"/>
       </w:pPr>
-      <w:bookmarkStart w:id="10" w:name="_9ce86cd89e816c495213921bce711286420babc"/>
       <w:r>
         <w:t xml:space="preserve">STATEMENT OF THE CASE</w:t>
       </w:r>
-      <w:bookmarkEnd w:id="10"/>
     </w:p>
     <w:p>
       <w:pPr>
@@ -2659,15 +2658,14 @@
         <w:t xml:space="preserve">(“Title VII”). Mr. Chapman claims that the Office discriminated against him based on his color and his race, and that the Office retaliated against him for voicing his concerns about race relations in the workplace and for filing a fair practices complaint. (J.A. 6-34.)</w:t>
       </w:r>
     </w:p>
+    <w:bookmarkStart w:id="21" w:name="X61539633e71d8adb2be1d8b786d77ed03de98e4"/>
     <w:p>
       <w:pPr>
         <w:pStyle w:val="Heading2"/>
       </w:pPr>
-      <w:bookmarkStart w:id="11" w:name="_61539633e71d8adb2be1d8b786d77ed03de98e4"/>
       <w:r>
         <w:t xml:space="preserve">The Office of the State Fire Marshal and Its Primary Duties.</w:t>
       </w:r>
-      <w:bookmarkEnd w:id="11"/>
     </w:p>
     <w:p>
       <w:pPr>
@@ -2715,15 +2713,15 @@
         <w:t xml:space="preserve">One of the primary duties of fire marshals at the Office is to complete and submit “fire origin reports,” which document whether the cause of a particular fire or explosion was intentional or accidental. (J.A. 81, J.A. 109.) These reports play a crucial role in informing the work of prosecutors, investigators, and insurance professionals alike. (J.A. 82-85, J.A. 109.)</w:t>
       </w:r>
     </w:p>
+    <w:bookmarkEnd w:id="21"/>
+    <w:bookmarkStart w:id="23" w:name="X5b8f1e5e67c82422a840d887d0b9821ddab324b"/>
     <w:p>
       <w:pPr>
         <w:pStyle w:val="Heading2"/>
       </w:pPr>
-      <w:bookmarkStart w:id="12" w:name="_5b8f1e5e67c82422a840d887d0b9821ddab324b"/>
       <w:r>
         <w:t xml:space="preserve">Mr. Chapman’s Chronic Issue with Overdue Reports</w:t>
       </w:r>
-      <w:bookmarkEnd w:id="12"/>
     </w:p>
     <w:p>
       <w:pPr>
@@ -2752,7 +2750,7 @@
         <w:rPr>
           <w:rStyle w:val="FootnoteReference"/>
         </w:rPr>
-        <w:footnoteReference w:id="13"/>
+        <w:footnoteReference w:id="22"/>
       </w:r>
       <w:r>
         <w:t xml:space="preserve"> </w:t>
@@ -2761,15 +2759,15 @@
         <w:t xml:space="preserve">(J.A. 113.) The issue, however, did not resolve because, by November of 2018, NERO still had 143 incomplete cases. (J.A. 114.)</w:t>
       </w:r>
     </w:p>
+    <w:bookmarkEnd w:id="23"/>
+    <w:bookmarkStart w:id="24" w:name="procedural-history"/>
     <w:p>
       <w:pPr>
         <w:pStyle w:val="Heading2"/>
       </w:pPr>
-      <w:bookmarkStart w:id="14" w:name="_5ae8abf30e17063e01acabd435d57e23338d977"/>
       <w:r>
         <w:t xml:space="preserve">Procedural History</w:t>
       </w:r>
-      <w:bookmarkEnd w:id="14"/>
     </w:p>
     <w:p>
       <w:pPr>
@@ -2787,15 +2785,16 @@
         <w:t xml:space="preserve">Mr. Chapman filed suit on February 17, 2023, asserting Title VII claims of race discrimination, color discrimination, and retaliation (Counts I-III), a claim based on the Maryland Fair Employment Practices Act (Count IV), a retaliation claim under the Family and Medical Leave Act (Count V), and a claim based on violations of 42 U.S.C. § 1981 and § 1983 (Count VI). (J.A. 6-34.)</w:t>
       </w:r>
     </w:p>
+    <w:bookmarkEnd w:id="24"/>
+    <w:bookmarkEnd w:id="25"/>
+    <w:bookmarkStart w:id="26" w:name="summary-of-argument"/>
     <w:p>
       <w:pPr>
         <w:pStyle w:val="Heading1"/>
       </w:pPr>
-      <w:bookmarkStart w:id="15" w:name="_46604d111831f1e81d7ad6a7ac73e8c7d2c5dc8"/>
       <w:r>
         <w:t xml:space="preserve">SUMMARY OF ARGUMENT</w:t>
       </w:r>
-      <w:bookmarkEnd w:id="15"/>
     </w:p>
     <w:p>
       <w:pPr>
@@ -2805,21 +2804,21 @@
         <w:t xml:space="preserve">For years, Mr. Chapman failed to ensure that he and his subordinates timely submitted their fire origin reports, which he readily admits is an essential function he neglected to perform. This dereliction became so severe and persisted for so long that, at one point, Mr. Chapman and his region maintained a backlog of delinquent reports that totaled more than all the other regions combined. Nevertheless, despite numerous efforts by Mr. Chapman’s supervisors to help get him back on track, the Office was eventually forced to discipline Mr. Chapman’s continued failure to meet the Office’s basic expectations of a fire marshal and of a supervisor. Consequently, the district court correctly concluded that Mr. Chapman failed to establish a prima facie case of discrimination because he (1) cannot show satisfactory job performance, and (2) cannot identify any similarly-situated comparators who engaged in misconduct that was as serious as his, but that the Office treated more favorably.</w:t>
       </w:r>
     </w:p>
+    <w:bookmarkEnd w:id="26"/>
+    <w:bookmarkStart w:id="30" w:name="argument"/>
     <w:p>
       <w:pPr>
         <w:pStyle w:val="Heading1"/>
       </w:pPr>
-      <w:bookmarkStart w:id="16" w:name="_argument"/>
       <w:r>
         <w:t xml:space="preserve">ARGUMENT</w:t>
       </w:r>
-      <w:bookmarkEnd w:id="16"/>
-    </w:p>
+    </w:p>
+    <w:bookmarkStart w:id="27" w:name="Xc5f4f7cf9df7434962f291a18d494566acaad14"/>
     <w:p>
       <w:pPr>
         <w:pStyle w:val="Heading2"/>
       </w:pPr>
-      <w:bookmarkStart w:id="17" w:name="_c5f4f7cf9df7434962f291a18d494566acaad14"/>
       <w:r>
         <w:t xml:space="preserve">I.</w:t>
       </w:r>
@@ -2829,7 +2828,6 @@
       <w:r>
         <w:t xml:space="preserve">THIS COURT REVIEWS THE DISTRICT COURT’S GRANT OF SUMMARY JUDGMENT FOR LEGAL ERROR.</w:t>
       </w:r>
-      <w:bookmarkEnd w:id="17"/>
     </w:p>
     <w:p>
       <w:pPr>
@@ -3096,11 +3094,12 @@
         <w:t xml:space="preserve">.</w:t>
       </w:r>
     </w:p>
+    <w:bookmarkEnd w:id="27"/>
+    <w:bookmarkStart w:id="29" w:name="X9436050971e50ef6f70c87efc1ee8b4d0939673"/>
     <w:p>
       <w:pPr>
         <w:pStyle w:val="Heading2"/>
       </w:pPr>
-      <w:bookmarkStart w:id="18" w:name="_9436050971e50ef6f70c87efc1ee8b4d0939673"/>
       <w:r>
         <w:t xml:space="preserve">II.</w:t>
       </w:r>
@@ -3110,7 +3109,6 @@
       <w:r>
         <w:t xml:space="preserve">THE DISTRICT COURT CORRECTLY CONCLUDED THAT MR. CHAPMAN FAILED TO ESTABLISH PRIMA FACIE CASES OF DISCRIMINATION AND RETALIATION.</w:t>
       </w:r>
-      <w:bookmarkEnd w:id="18"/>
     </w:p>
     <w:p>
       <w:pPr>
@@ -3240,11 +3238,11 @@
         <w:t xml:space="preserve">. Here, Mr. Chapman fails in both respects, and the district court correctly granted summary judgment in the Office’s favor.</w:t>
       </w:r>
     </w:p>
+    <w:bookmarkStart w:id="28" w:name="X231fa4faf59223c8e84cc75fade2392e7675b5f"/>
     <w:p>
       <w:pPr>
         <w:pStyle w:val="Heading3"/>
       </w:pPr>
-      <w:bookmarkStart w:id="19" w:name="_231fa4faf59223c8e84cc75fade2392e7675b5f"/>
       <w:r>
         <w:t xml:space="preserve">A.</w:t>
       </w:r>
@@ -3254,7 +3252,6 @@
       <w:r>
         <w:t xml:space="preserve">The District Court Correctly Concluded That Mr. Chapman Failed to Establish a Prima Facie Case of Race or Color Discrimination Because He Cannot Show Satisfactory Job Performance or That He was Subjected to Disparate Treatment.</w:t>
       </w:r>
-      <w:bookmarkEnd w:id="19"/>
     </w:p>
     <w:p>
       <w:pPr>
@@ -3379,15 +3376,17 @@
         <w:t xml:space="preserve">(refusing to consider the repercussions of a disciplinary investigation as adverse actions under Title VII and holding that “terms, conditions, or benefits of a person’s employment do not typically, if ever, include general immunity from the application of basic employment policies or exemption from a state agency’s disciplinary procedures”).</w:t>
       </w:r>
     </w:p>
+    <w:bookmarkEnd w:id="28"/>
+    <w:bookmarkEnd w:id="29"/>
+    <w:bookmarkEnd w:id="30"/>
+    <w:bookmarkStart w:id="31" w:name="conclusion"/>
     <w:p>
       <w:pPr>
         <w:pStyle w:val="Heading1"/>
       </w:pPr>
-      <w:bookmarkStart w:id="20" w:name="_conclusion"/>
       <w:r>
         <w:t xml:space="preserve">CONCLUSION</w:t>
       </w:r>
-      <w:bookmarkEnd w:id="20"/>
     </w:p>
     <w:p>
       <w:pPr>
@@ -3578,7 +3577,7 @@
         <w:ind w:firstLine="0"/>
       </w:pPr>
       <w:r>
-        <w:t xml:space="preserve">2.  This brief complies with the typeface requirements of Federal Rule of Appellate Procedure 32(a)(5) and the type style requirements of Rule 32(a)(6) because this brief has been prepared in a proportionally spaced typeface, EB Garamond, in fourteen-point type.</w:t>
+        <w:t xml:space="preserve">2.  This brief complies with the typeface requirements of Federal Rule of Appellate Procedure 32(a)(5) and the type style requirements of Rule 32(a)(6) because this brief has been prepared in a proportionally spaced typeface, Liberation Serif, in fourteen-point type.</w:t>
       </w:r>
     </w:p>
     <w:p>
@@ -3644,10 +3643,11 @@
         <w:t xml:space="preserve">/s/ Kyle A. Ashe</w:t>
       </w:r>
     </w:p>
+    <w:bookmarkEnd w:id="31"/>
     <w:sectPr>
-      <w:footerReference w:type="default" r:id="rIdFooter1"/>
-      <w:pgSz w:w="12240" w:h="15840"/>
-      <w:pgMar w:top="1440" w:right="1440" w:bottom="1440" w:left="1440" w:header="720" w:footer="720" w:gutter="0"/>
+      <w:footerReference r:id="rId9" w:type="default"/>
+      <w:pgSz w:h="15840" w:w="12240"/>
+      <w:pgMar w:bottom="1440" w:footer="720" w:gutter="0" w:header="720" w:left="1440" w:right="1440" w:top="1440"/>
       <w:pgNumType w:fmt="decimal" w:start="1"/>
     </w:sectPr>
   </w:body>
@@ -3700,7 +3700,7 @@
       </w:r>
     </w:p>
   </w:footnote>
-  <w:footnote w:id="13">
+  <w:footnote w:id="22">
     <w:p>
       <w:pPr>
         <w:pStyle w:val="FootnoteText"/>
@@ -3811,7 +3811,7 @@
   <w:docDefaults>
     <w:rPrDefault>
       <w:rPr>
-        <w:rFonts w:ascii="EB Garamond" w:hAnsi="EB Garamond" w:eastAsia="EB Garamond" w:cs="EB Garamond"/>
+        <w:rFonts w:ascii="Liberation Serif" w:cs="Liberation Serif" w:eastAsia="Liberation Serif" w:hAnsi="Liberation Serif"/>
         <w:sz w:val="28"/>
         <w:szCs w:val="28"/>
         <w:lang w:val="en-US"/>
@@ -3823,65 +3823,65 @@
       </w:pPr>
     </w:pPrDefault>
   </w:docDefaults>
-  <w:style w:type="paragraph" w:default="1" w:styleId="Normal">
+  <w:style w:default="1" w:styleId="Normal" w:type="paragraph">
     <w:name w:val="Normal"/>
     <w:qFormat/>
   </w:style>
-  <w:style w:type="character" w:default="1" w:styleId="DefaultParagraphFont">
+  <w:style w:default="1" w:styleId="DefaultParagraphFont" w:type="character">
     <w:name w:val="Default Paragraph Font"/>
     <w:uiPriority w:val="1"/>
     <w:semiHidden/>
   </w:style>
-  <w:style w:type="table" w:default="1" w:styleId="TableNormal">
+  <w:style w:default="1" w:styleId="TableNormal" w:type="table">
     <w:name w:val="Normal Table"/>
     <w:semiHidden/>
     <w:tblPr>
-      <w:tblInd w:w="0" w:type="dxa"/>
+      <w:tblInd w:type="dxa" w:w="0"/>
       <w:tblCellMar>
-        <w:top w:w="0" w:type="dxa"/>
-        <w:left w:w="108" w:type="dxa"/>
-        <w:bottom w:w="0" w:type="dxa"/>
-        <w:right w:w="108" w:type="dxa"/>
+        <w:top w:type="dxa" w:w="0"/>
+        <w:left w:type="dxa" w:w="108"/>
+        <w:bottom w:type="dxa" w:w="0"/>
+        <w:right w:type="dxa" w:w="108"/>
       </w:tblCellMar>
     </w:tblPr>
   </w:style>
-  <w:style w:type="numbering" w:default="1" w:styleId="NoList">
+  <w:style w:default="1" w:styleId="NoList" w:type="numbering">
     <w:name w:val="No List"/>
     <w:semiHidden/>
   </w:style>
-  <w:style w:type="paragraph" w:styleId="BodyText">
+  <w:style w:styleId="BodyText" w:type="paragraph">
     <w:name w:val="Body Text"/>
     <w:basedOn w:val="Normal"/>
     <w:qFormat/>
     <w:pPr>
-      <w:spacing w:before="0" w:after="0" w:line="629" w:lineRule="exact"/>
+      <w:spacing w:after="0" w:before="0" w:line="629" w:lineRule="exact"/>
       <w:ind w:firstLine="720"/>
     </w:pPr>
   </w:style>
-  <w:style w:type="paragraph" w:styleId="FirstParagraph">
+  <w:style w:styleId="FirstParagraph" w:type="paragraph">
     <w:name w:val="First Paragraph"/>
     <w:basedOn w:val="BodyText"/>
     <w:next w:val="BodyText"/>
     <w:qFormat/>
   </w:style>
-  <w:style w:type="paragraph" w:styleId="Compact">
+  <w:style w:styleId="Compact" w:type="paragraph">
     <w:name w:val="Compact"/>
     <w:basedOn w:val="BodyText"/>
     <w:qFormat/>
     <w:pPr>
-      <w:spacing w:before="0" w:after="0" w:line="629" w:lineRule="exact"/>
+      <w:spacing w:after="0" w:before="0" w:line="629" w:lineRule="exact"/>
     </w:pPr>
   </w:style>
-  <w:style w:type="paragraph" w:styleId="BlockText">
+  <w:style w:styleId="BlockText" w:type="paragraph">
     <w:name w:val="Block Text"/>
     <w:basedOn w:val="Normal"/>
     <w:qFormat/>
     <w:pPr>
-      <w:spacing w:before="0" w:after="180" w:line="400" w:lineRule="exact"/>
-      <w:ind w:left="720" w:right="720" w:firstLine="0"/>
+      <w:spacing w:after="180" w:before="0" w:line="400" w:lineRule="exact"/>
+      <w:ind w:firstLine="0" w:left="720" w:right="720"/>
     </w:pPr>
   </w:style>
-  <w:style w:type="paragraph" w:styleId="Heading1">
+  <w:style w:styleId="Heading1" w:type="paragraph">
     <w:name w:val="heading 1"/>
     <w:basedOn w:val="Normal"/>
     <w:next w:val="BodyText"/>
@@ -3889,7 +3889,7 @@
     <w:pPr>
       <w:keepNext/>
       <w:keepLines/>
-      <w:spacing w:before="300" w:after="220" w:line="400" w:lineRule="exact"/>
+      <w:spacing w:after="220" w:before="300" w:line="400" w:lineRule="exact"/>
       <w:ind w:firstLine="0"/>
       <w:jc w:val="center"/>
       <w:outlineLvl w:val="0"/>
@@ -3899,7 +3899,7 @@
       <w:caps/>
     </w:rPr>
   </w:style>
-  <w:style w:type="paragraph" w:styleId="Heading2">
+  <w:style w:styleId="Heading2" w:type="paragraph">
     <w:name w:val="heading 2"/>
     <w:basedOn w:val="Normal"/>
     <w:next w:val="BodyText"/>
@@ -3908,17 +3908,17 @@
       <w:keepNext/>
       <w:keepLines/>
       <w:tabs>
-        <w:tab w:val="left" w:pos="1440"/>
+        <w:tab w:pos="1440" w:val="left"/>
       </w:tabs>
-      <w:spacing w:before="220" w:after="180" w:line="400" w:lineRule="exact"/>
-      <w:ind w:left="1440" w:hanging="720" w:firstLine="0"/>
+      <w:spacing w:after="180" w:before="220" w:line="400" w:lineRule="exact"/>
+      <w:ind w:firstLine="0" w:hanging="720" w:left="1440"/>
       <w:outlineLvl w:val="1"/>
     </w:pPr>
     <w:rPr>
       <w:b/>
     </w:rPr>
   </w:style>
-  <w:style w:type="paragraph" w:styleId="Heading3">
+  <w:style w:styleId="Heading3" w:type="paragraph">
     <w:name w:val="heading 3"/>
     <w:basedOn w:val="Normal"/>
     <w:next w:val="BodyText"/>
@@ -3927,17 +3927,17 @@
       <w:keepNext/>
       <w:keepLines/>
       <w:tabs>
-        <w:tab w:val="left" w:pos="2160"/>
+        <w:tab w:pos="2160" w:val="left"/>
       </w:tabs>
-      <w:spacing w:before="220" w:after="180" w:line="400" w:lineRule="exact"/>
-      <w:ind w:left="2160" w:hanging="720" w:firstLine="0"/>
+      <w:spacing w:after="180" w:before="220" w:line="400" w:lineRule="exact"/>
+      <w:ind w:firstLine="0" w:hanging="720" w:left="2160"/>
       <w:outlineLvl w:val="2"/>
     </w:pPr>
     <w:rPr>
       <w:b/>
     </w:rPr>
   </w:style>
-  <w:style w:type="paragraph" w:styleId="Heading4">
+  <w:style w:styleId="Heading4" w:type="paragraph">
     <w:name w:val="heading 4"/>
     <w:basedOn w:val="Normal"/>
     <w:next w:val="BodyText"/>
@@ -3946,10 +3946,10 @@
       <w:keepNext/>
       <w:keepLines/>
       <w:tabs>
-        <w:tab w:val="left" w:pos="2880"/>
+        <w:tab w:pos="2880" w:val="left"/>
       </w:tabs>
-      <w:spacing w:before="220" w:after="180" w:line="400" w:lineRule="exact"/>
-      <w:ind w:left="2880" w:hanging="720" w:firstLine="0"/>
+      <w:spacing w:after="180" w:before="220" w:line="400" w:lineRule="exact"/>
+      <w:ind w:firstLine="0" w:hanging="720" w:left="2880"/>
       <w:outlineLvl w:val="3"/>
     </w:pPr>
     <w:rPr>
@@ -3957,7 +3957,7 @@
       <w:i/>
     </w:rPr>
   </w:style>
-  <w:style w:type="paragraph" w:styleId="Heading5">
+  <w:style w:styleId="Heading5" w:type="paragraph">
     <w:name w:val="heading 5"/>
     <w:basedOn w:val="Normal"/>
     <w:next w:val="BodyText"/>
@@ -3966,10 +3966,10 @@
       <w:keepNext/>
       <w:keepLines/>
       <w:tabs>
-        <w:tab w:val="left" w:pos="3600"/>
+        <w:tab w:pos="3600" w:val="left"/>
       </w:tabs>
-      <w:spacing w:before="220" w:after="180" w:line="400" w:lineRule="exact"/>
-      <w:ind w:left="3600" w:hanging="720" w:firstLine="0"/>
+      <w:spacing w:after="180" w:before="220" w:line="400" w:lineRule="exact"/>
+      <w:ind w:firstLine="0" w:hanging="720" w:left="3600"/>
       <w:outlineLvl w:val="4"/>
     </w:pPr>
     <w:rPr>
@@ -3977,7 +3977,7 @@
       <w:i/>
     </w:rPr>
   </w:style>
-  <w:style w:type="paragraph" w:styleId="FootnoteText">
+  <w:style w:styleId="FootnoteText" w:type="paragraph">
     <w:name w:val="footnote text"/>
     <w:basedOn w:val="Normal"/>
     <w:qFormat/>
@@ -3985,76 +3985,76 @@
       <w:spacing w:after="100" w:line="400" w:lineRule="exact"/>
     </w:pPr>
   </w:style>
-  <w:style w:type="character" w:styleId="FootnoteReference">
+  <w:style w:styleId="FootnoteReference" w:type="character">
     <w:name w:val="footnote reference"/>
     <w:vertAlign w:val="superscript"/>
   </w:style>
-  <w:style w:type="character" w:styleId="Hyperlink">
+  <w:style w:styleId="Hyperlink" w:type="character">
     <w:name w:val="Hyperlink"/>
     <w:rPr>
       <w:color w:val="000000"/>
     </w:rPr>
   </w:style>
-  <w:style w:type="paragraph" w:styleId="TOC1">
+  <w:style w:styleId="TOC1" w:type="paragraph">
     <w:name w:val="toc 1"/>
     <w:basedOn w:val="Normal"/>
     <w:next w:val="Normal"/>
     <w:pPr>
       <w:tabs>
-        <w:tab w:val="right" w:leader="dot" w:pos="9360"/>
+        <w:tab w:leader="dot" w:pos="9360" w:val="right"/>
       </w:tabs>
-      <w:spacing w:before="120" w:after="0" w:line="400" w:lineRule="exact"/>
+      <w:spacing w:after="0" w:before="120" w:line="400" w:lineRule="exact"/>
       <w:ind w:right="720"/>
     </w:pPr>
   </w:style>
-  <w:style w:type="paragraph" w:styleId="TOC2">
+  <w:style w:styleId="TOC2" w:type="paragraph">
     <w:name w:val="toc 2"/>
     <w:basedOn w:val="Normal"/>
     <w:next w:val="Normal"/>
     <w:pPr>
       <w:tabs>
-        <w:tab w:val="right" w:leader="dot" w:pos="9360"/>
+        <w:tab w:leader="dot" w:pos="9360" w:val="right"/>
       </w:tabs>
-      <w:spacing w:before="60" w:after="0" w:line="400" w:lineRule="exact"/>
+      <w:spacing w:after="0" w:before="60" w:line="400" w:lineRule="exact"/>
       <w:ind w:left="720" w:right="720"/>
     </w:pPr>
   </w:style>
-  <w:style w:type="paragraph" w:styleId="TOC3">
+  <w:style w:styleId="TOC3" w:type="paragraph">
     <w:name w:val="toc 3"/>
     <w:basedOn w:val="Normal"/>
     <w:next w:val="Normal"/>
     <w:pPr>
       <w:tabs>
-        <w:tab w:val="right" w:leader="dot" w:pos="9360"/>
+        <w:tab w:leader="dot" w:pos="9360" w:val="right"/>
       </w:tabs>
-      <w:spacing w:before="60" w:after="0" w:line="400" w:lineRule="exact"/>
+      <w:spacing w:after="0" w:before="60" w:line="400" w:lineRule="exact"/>
       <w:ind w:left="1440" w:right="720"/>
     </w:pPr>
   </w:style>
-  <w:style w:type="paragraph" w:styleId="TOC4">
+  <w:style w:styleId="TOC4" w:type="paragraph">
     <w:name w:val="toc 4"/>
     <w:basedOn w:val="Normal"/>
     <w:next w:val="Normal"/>
     <w:pPr>
       <w:tabs>
-        <w:tab w:val="right" w:leader="dot" w:pos="9360"/>
+        <w:tab w:leader="dot" w:pos="9360" w:val="right"/>
       </w:tabs>
-      <w:spacing w:before="60" w:after="0" w:line="400" w:lineRule="exact"/>
+      <w:spacing w:after="0" w:before="60" w:line="400" w:lineRule="exact"/>
       <w:ind w:left="2160" w:right="720"/>
     </w:pPr>
   </w:style>
-  <w:style w:type="paragraph" w:styleId="TableofAuthorities">
+  <w:style w:styleId="TableofAuthorities" w:type="paragraph">
     <w:name w:val="table of authorities"/>
     <w:basedOn w:val="Normal"/>
     <w:pPr>
       <w:tabs>
-        <w:tab w:val="right" w:leader="dot" w:pos="9360"/>
+        <w:tab w:leader="dot" w:pos="9360" w:val="right"/>
       </w:tabs>
-      <w:spacing w:before="100" w:after="0" w:line="400" w:lineRule="exact"/>
-      <w:ind w:left="500" w:hanging="500" w:right="720"/>
+      <w:spacing w:after="0" w:before="100" w:line="400" w:lineRule="exact"/>
+      <w:ind w:hanging="500" w:left="500" w:right="720"/>
     </w:pPr>
   </w:style>
-  <w:style w:type="paragraph" w:styleId="Footer">
+  <w:style w:styleId="Footer" w:type="paragraph">
     <w:name w:val="footer"/>
     <w:basedOn w:val="Normal"/>
     <w:pPr>

</xml_diff>